<commit_message>
docs: add personal 'about me' block to resume
Co-authored-by: Dmitry Bogatyrev <bogagree@gmail.com>
</commit_message>
<xml_diff>
--- a/docs/resume/resume_bogatyrev_it_lead.docx
+++ b/docs/resume/resume_bogatyrev_it_lead.docx
@@ -342,7 +342,7 @@
         <w:tabs>
           <w:tab w:pos="3760" w:val="left"/>
         </w:tabs>
-        <w:spacing w:after="0" w:before="0" w:line="240" w:lineRule="auto"/>
+        <w:spacing w:after="160" w:before="0" w:line="240" w:lineRule="auto"/>
         <w:ind w:left="3760" w:hanging="3760"/>
       </w:pPr>
       <w:r>
@@ -380,6 +380,52 @@
           <w:lang w:val="ru-RU"/>
         </w:rPr>
         <w:t>С марта 2026 года веду разработку с ИИ-агентами: основной инструмент — openCode на модели GLM 5.2, развёрнутой в закрытом контуре, плюс есть опыт работы в Cursor. Встраиваемый видеосервис написан в Cursor. Понимаю, на каких задачах агент реально ускоряет команду, а где его результат требует отдельного контроля на ревью, и считаю это уже частью инженерного процесса, а не экспериментом.</w:t>
+      </w:r>
+    </w:p>
+    <w:p>
+      <w:pPr>
+        <w:keepNext w:val="0"/>
+        <w:tabs>
+          <w:tab w:pos="3760" w:val="left"/>
+        </w:tabs>
+        <w:spacing w:after="0" w:before="0" w:line="240" w:lineRule="auto"/>
+        <w:ind w:left="3760" w:hanging="3760"/>
+      </w:pPr>
+      <w:r>
+        <w:rPr>
+          <w:rFonts w:ascii="Calibri" w:hAnsi="Calibri" w:cs="Calibri" w:eastAsia="Calibri"/>
+          <w:b/>
+          <w:smallCaps w:val="0"/>
+          <w:color w:val="4A4A4A"/>
+          <w:sz w:val="24"/>
+          <w:u w:val="none"/>
+          <w:lang w:val="ru-RU"/>
+        </w:rPr>
+        <w:t>О СЕБЕ</w:t>
+      </w:r>
+      <w:r>
+        <w:rPr>
+          <w:rFonts w:ascii="Calibri" w:hAnsi="Calibri" w:cs="Calibri" w:eastAsia="Calibri"/>
+          <w:b w:val="0"/>
+          <w:smallCaps w:val="0"/>
+          <w:color w:val="000000"/>
+          <w:sz w:val="24"/>
+          <w:u w:val="none"/>
+          <w:lang w:val="ru-RU"/>
+        </w:rPr>
+        <w:tab/>
+      </w:r>
+      <w:r>
+        <w:rPr>
+          <w:rFonts w:ascii="Calibri" w:hAnsi="Calibri" w:cs="Calibri" w:eastAsia="Calibri"/>
+          <w:b w:val="0"/>
+          <w:smallCaps w:val="0"/>
+          <w:color w:val="000000"/>
+          <w:sz w:val="28"/>
+          <w:u w:val="none"/>
+          <w:lang w:val="ru-RU"/>
+        </w:rPr>
+        <w:t>Прагматик с аналитическим складом ума: сначала разбираюсь в ограничениях и цене решения, потом берусь за реализацию. Мне важна экономика задачи, а не только её техническая красота. Пять лет занимаюсь в театральной студии — это разгружает голову и включает творческую часть, которая в инженерной работе задействована редко. Там же тренируются речь и работа с залом, и это заметно помогает на презентациях и защите идей.</w:t>
       </w:r>
     </w:p>
     <w:p>

</xml_diff>